<commit_message>
one of the lasts
</commit_message>
<xml_diff>
--- a/tmp/pdfs/anubhavPandey_resume_current.docx
+++ b/tmp/pdfs/anubhavPandey_resume_current.docx
@@ -398,7 +398,27 @@
           <w:sz w:val="18"/>
           <w:szCs w:val="18"/>
         </w:rPr>
-        <w:t xml:space="preserve">: Reduced the optimize-skill context footprint from 3,995 to 3,038 tokens while preserving seven optimization passes and safety gates; added two behavioral eval fixtures and kept the full suite at 7/7.</w:t>
+        <w:t xml:space="preserve">: Cut optimize-skill context 24% with 7/7 evals; </w:t>
+      </w:r>
+      <w:hyperlink r:id="rId10" w:history="1">
+        <w:r>
+          <w:rPr>
+            <w:rFonts w:ascii="Calibri" w:cs="Calibri" w:eastAsia="Calibri" w:hAnsi="Calibri"/>
+            <w:sz w:val="18"/>
+            <w:szCs w:val="18"/>
+            <w:color w:val="1155CC"/>
+            <w:u w:val="single"/>
+          </w:rPr>
+          <w:t xml:space="preserve">PR #1480</w:t>
+        </w:r>
+      </w:hyperlink>
+      <w:r>
+        <w:rPr>
+          <w:rFonts w:ascii="Calibri" w:cs="Calibri" w:eastAsia="Calibri" w:hAnsi="Calibri"/>
+          <w:sz w:val="18"/>
+          <w:szCs w:val="18"/>
+        </w:rPr>
+        <w:t xml:space="preserve">: Cut good-first-issue-author routing metadata 38% (273 to 168 tokens) while preserving safeguards.</w:t>
       </w:r>
     </w:p>
     <w:p>
@@ -433,34 +453,6 @@
     </w:p>
     <w:p>
       <w:pPr>
-        <w:tabs>
-          <w:tab w:val="right" w:pos="10224"/>
-        </w:tabs>
-        <w:spacing w:after="6" w:before="25"/>
-      </w:pPr>
-      <w:r>
-        <w:rPr>
-          <w:rFonts w:ascii="Calibri" w:cs="Calibri" w:eastAsia="Calibri" w:hAnsi="Calibri"/>
-          <w:b/>
-          <w:bCs/>
-          <w:sz w:val="19"/>
-          <w:szCs w:val="19"/>
-        </w:rPr>
-        <w:t xml:space="preserve">Software Engineering Intern, Reach Inc.</w:t>
-      </w:r>
-      <w:r>
-        <w:rPr>
-          <w:rFonts w:ascii="Calibri" w:cs="Calibri" w:eastAsia="Calibri" w:hAnsi="Calibri"/>
-          <w:i/>
-          <w:iCs/>
-          <w:sz w:val="18"/>
-          <w:szCs w:val="18"/>
-        </w:rPr>
-        <w:t xml:space="preserve">	Jun 2025 to Jul 2025</w:t>
-      </w:r>
-    </w:p>
-    <w:p>
-      <w:pPr>
         <w:pStyle w:val="ListParagraph"/>
         <w:numPr>
           <w:ilvl w:val="0"/>
@@ -468,13 +460,53 @@
         </w:numPr>
         <w:spacing w:after="12"/>
       </w:pPr>
-      <w:r>
-        <w:rPr>
-          <w:rFonts w:ascii="Calibri" w:cs="Calibri" w:eastAsia="Calibri" w:hAnsi="Calibri"/>
-          <w:sz w:val="18"/>
-          <w:szCs w:val="18"/>
-        </w:rPr>
-        <w:t xml:space="preserve">Shipped backend logic and REST API endpoints in Node.js and Express.js for new product features, taking each one from an initial spec through to production without needing much handholding.</w:t>
+      <w:hyperlink r:id="rId9" w:history="1">
+        <w:r>
+          <w:rPr>
+            <w:rFonts w:ascii="Calibri" w:cs="Calibri" w:eastAsia="Calibri" w:hAnsi="Calibri"/>
+            <w:sz w:val="18"/>
+            <w:szCs w:val="18"/>
+            <w:color w:val="1155CC"/>
+            <w:u w:val="single"/>
+          </w:rPr>
+          <w:t xml:space="preserve">OWASP cve-lite-cli PR #1240</w:t>
+        </w:r>
+      </w:hyperlink>
+      <w:r>
+        <w:rPr>
+          <w:rFonts w:ascii="Calibri" w:cs="Calibri" w:eastAsia="Calibri" w:hAnsi="Calibri"/>
+          <w:sz w:val="18"/>
+          <w:szCs w:val="18"/>
+        </w:rPr>
+        <w:t xml:space="preserve">: Fixed OA008 semver diagnostics to distinguish below-range, above-range, and union-gap mismatches; added regression coverage and passed lint, build, and focused tests.</w:t>
+      </w:r>
+    </w:p>
+    <w:p>
+      <w:pPr>
+        <w:tabs>
+          <w:tab w:val="right" w:pos="10224"/>
+        </w:tabs>
+        <w:spacing w:after="6" w:before="25"/>
+      </w:pPr>
+      <w:r>
+        <w:rPr>
+          <w:rFonts w:ascii="Calibri" w:cs="Calibri" w:eastAsia="Calibri" w:hAnsi="Calibri"/>
+          <w:b/>
+          <w:bCs/>
+          <w:sz w:val="19"/>
+          <w:szCs w:val="19"/>
+        </w:rPr>
+        <w:t xml:space="preserve">Software Engineering Intern, Reach Inc.</w:t>
+      </w:r>
+      <w:r>
+        <w:rPr>
+          <w:rFonts w:ascii="Calibri" w:cs="Calibri" w:eastAsia="Calibri" w:hAnsi="Calibri"/>
+          <w:i/>
+          <w:iCs/>
+          <w:sz w:val="18"/>
+          <w:szCs w:val="18"/>
+        </w:rPr>
+        <w:t xml:space="preserve">	Jun 2025 to Jul 2025</w:t>
       </w:r>
     </w:p>
     <w:p>
@@ -492,7 +524,7 @@
           <w:sz w:val="18"/>
           <w:szCs w:val="18"/>
         </w:rPr>
-        <w:t xml:space="preserve">Extended core site functionality through server side integrations that matched the team's existing REST API conventions and code review standards.</w:t>
+        <w:t xml:space="preserve">Shipped Node.js and Express.js REST endpoints and server-side integrations from specification through production, following the team's API conventions and code review standards.</w:t>
       </w:r>
     </w:p>
     <w:p>

</xml_diff>